<commit_message>
feat: consolidate sheet metal plugin updates
</commit_message>
<xml_diff>
--- a/06_PiLianZuanBanJin/docs/批量转钣金使用说明.docx
+++ b/06_PiLianZuanBanJin/docs/批量转钣金使用说明.docx
@@ -225,14 +225,14 @@
     </w:p>
     <w:p>
       <w:r>
-        <w:t>下图按主对话框上的按钮、输入框、下拉框和开关做了编号。实际软件界面不会显示红色编号，编号只用于对照本文档说明。</w:t>
+        <w:t>下图来自 NX 中实际运行的“自动转钣金”对话框。截图右侧的错误窗口和聊天背景已通过文档裁切隐藏，没有重画或替换任何对话框控件。请按界面从上到下，对照下表查看每个选项的用途。</w:t>
       </w:r>
     </w:p>
     <w:p>
       <w:r>
         <w:drawing>
           <wp:inline xmlns:a="http://schemas.openxmlformats.org/drawingml/2006/main" xmlns:pic="http://schemas.openxmlformats.org/drawingml/2006/picture">
-            <wp:extent cx="6126480" cy="4157254"/>
+            <wp:extent cx="2788920" cy="5230368"/>
             <wp:docPr id="2" name="Picture 2"/>
             <wp:cNvGraphicFramePr>
               <a:graphicFrameLocks noChangeAspect="1"/>
@@ -241,11 +241,12 @@
               <a:graphicData uri="http://schemas.openxmlformats.org/drawingml/2006/picture">
                 <pic:pic>
                   <pic:nvPicPr>
-                    <pic:cNvPr id="0" name="主对话框控件编号.png"/>
+                    <pic:cNvPr id="0" name="主对话框真实截图.png"/>
                     <pic:cNvPicPr/>
                   </pic:nvPicPr>
                   <pic:blipFill>
                     <a:blip r:embed="rId10"/>
+                    <a:srcRect l="14933" t="20498" r="50133" b="22630"/>
                     <a:stretch>
                       <a:fillRect/>
                     </a:stretch>
@@ -253,7 +254,7 @@
                   <pic:spPr>
                     <a:xfrm>
                       <a:off x="0" y="0"/>
-                      <a:ext cx="6126480" cy="4157254"/>
+                      <a:ext cx="2788920" cy="5230368"/>
                     </a:xfrm>
                     <a:prstGeom prst="rect"/>
                   </pic:spPr>
@@ -2337,14 +2338,14 @@
     </w:p>
     <w:p>
       <w:r>
-        <w:t>在装配环境下运行时，会先出现待处理部件列表。可以先设置过滤条件，再勾选需要处理的部件。</w:t>
+        <w:t>在装配环境下运行时，会先出现待处理部件列表。下图来自实际装配模型运行界面。先设置过滤条件，再勾选需要处理的部件；点击“确定”后才进入主参数对话框。</w:t>
       </w:r>
     </w:p>
     <w:p>
       <w:r>
         <w:drawing>
           <wp:inline xmlns:a="http://schemas.openxmlformats.org/drawingml/2006/main" xmlns:pic="http://schemas.openxmlformats.org/drawingml/2006/picture">
-            <wp:extent cx="6126480" cy="3675888"/>
+            <wp:extent cx="6126480" cy="2281347"/>
             <wp:docPr id="3" name="Picture 3"/>
             <wp:cNvGraphicFramePr>
               <a:graphicFrameLocks noChangeAspect="1"/>
@@ -2353,7 +2354,7 @@
               <a:graphicData uri="http://schemas.openxmlformats.org/drawingml/2006/picture">
                 <pic:pic>
                   <pic:nvPicPr>
-                    <pic:cNvPr id="0" name="装配列表控件编号.png"/>
+                    <pic:cNvPr id="0" name="装配选择真实截图.png"/>
                     <pic:cNvPicPr/>
                   </pic:nvPicPr>
                   <pic:blipFill>
@@ -2365,7 +2366,7 @@
                   <pic:spPr>
                     <a:xfrm>
                       <a:off x="0" y="0"/>
-                      <a:ext cx="6126480" cy="3675888"/>
+                      <a:ext cx="6126480" cy="2281347"/>
                     </a:xfrm>
                     <a:prstGeom prst="rect"/>
                   </pic:spPr>
@@ -3876,7 +3877,1044 @@
         <w:pStyle w:val="Heading1"/>
       </w:pPr>
       <w:r>
-        <w:t>5. 手动选择基面和 X 向</w:t>
+        <w:t>5. 折弯系数规则表</w:t>
+      </w:r>
+    </w:p>
+    <w:p>
+      <w:r>
+        <w:t>在主对话框点击“规则设置…”打开折弯系数表。下图为实际运行界面。上方决定不同折弯类型使用哪一列数据，下方维护每种材料和板厚的具体数值。</w:t>
+      </w:r>
+    </w:p>
+    <w:p>
+      <w:r>
+        <w:drawing>
+          <wp:inline xmlns:a="http://schemas.openxmlformats.org/drawingml/2006/main" xmlns:pic="http://schemas.openxmlformats.org/drawingml/2006/picture">
+            <wp:extent cx="6126480" cy="5588659"/>
+            <wp:docPr id="4" name="Picture 4"/>
+            <wp:cNvGraphicFramePr>
+              <a:graphicFrameLocks noChangeAspect="1"/>
+            </wp:cNvGraphicFramePr>
+            <a:graphic>
+              <a:graphicData uri="http://schemas.openxmlformats.org/drawingml/2006/picture">
+                <pic:pic>
+                  <pic:nvPicPr>
+                    <pic:cNvPr id="0" name="规则表真实截图.png"/>
+                    <pic:cNvPicPr/>
+                  </pic:nvPicPr>
+                  <pic:blipFill>
+                    <a:blip r:embed="rId12"/>
+                    <a:stretch>
+                      <a:fillRect/>
+                    </a:stretch>
+                  </pic:blipFill>
+                  <pic:spPr>
+                    <a:xfrm>
+                      <a:off x="0" y="0"/>
+                      <a:ext cx="6126480" cy="5588659"/>
+                    </a:xfrm>
+                    <a:prstGeom prst="rect"/>
+                  </pic:spPr>
+                </pic:pic>
+              </a:graphicData>
+            </a:graphic>
+          </wp:inline>
+        </w:drawing>
+      </w:r>
+    </w:p>
+    <w:tbl>
+      <w:tblPr>
+        <w:tblStyle w:val="TableGrid"/>
+        <w:tblW w:type="auto" w:w="0"/>
+        <w:jc w:val="center"/>
+        <w:tblLayout w:type="fixed"/>
+        <w:tblLook w:firstColumn="1" w:firstRow="1" w:lastColumn="0" w:lastRow="0" w:noHBand="0" w:noVBand="1" w:val="04A0"/>
+      </w:tblPr>
+      <w:tblGrid>
+        <w:gridCol w:w="3264"/>
+        <w:gridCol w:w="3264"/>
+        <w:gridCol w:w="3264"/>
+      </w:tblGrid>
+      <w:tr>
+        <w:tc>
+          <w:tcPr>
+            <w:tcW w:type="dxa" w:w="2304"/>
+            <w:vAlign w:val="center"/>
+            <w:shd w:fill="E8EEF5"/>
+          </w:tcPr>
+          <w:p>
+            <w:pPr>
+              <w:spacing w:after="0" w:before="0" w:line="240" w:lineRule="auto"/>
+            </w:pPr>
+            <w:r>
+              <w:rPr>
+                <w:rFonts w:ascii="微软雅黑" w:hAnsi="微软雅黑" w:eastAsia="微软雅黑"/>
+                <w:b/>
+                <w:sz w:val="18"/>
+              </w:rPr>
+            </w:r>
+            <w:r>
+              <w:rPr>
+                <w:rFonts w:ascii="微软雅黑" w:hAnsi="微软雅黑" w:eastAsia="微软雅黑"/>
+                <w:b/>
+                <w:sz w:val="18"/>
+              </w:rPr>
+              <w:t>控件</w:t>
+            </w:r>
+          </w:p>
+        </w:tc>
+        <w:tc>
+          <w:tcPr>
+            <w:tcW w:type="dxa" w:w="1440"/>
+            <w:vAlign w:val="center"/>
+            <w:shd w:fill="E8EEF5"/>
+          </w:tcPr>
+          <w:p>
+            <w:pPr>
+              <w:spacing w:after="0" w:before="0" w:line="240" w:lineRule="auto"/>
+            </w:pPr>
+            <w:r>
+              <w:rPr>
+                <w:rFonts w:ascii="微软雅黑" w:hAnsi="微软雅黑" w:eastAsia="微软雅黑"/>
+                <w:b/>
+                <w:sz w:val="18"/>
+              </w:rPr>
+            </w:r>
+            <w:r>
+              <w:rPr>
+                <w:rFonts w:ascii="微软雅黑" w:hAnsi="微软雅黑" w:eastAsia="微软雅黑"/>
+                <w:b/>
+                <w:sz w:val="18"/>
+              </w:rPr>
+              <w:t>类型</w:t>
+            </w:r>
+          </w:p>
+        </w:tc>
+        <w:tc>
+          <w:tcPr>
+            <w:tcW w:type="dxa" w:w="5760"/>
+            <w:vAlign w:val="center"/>
+            <w:shd w:fill="E8EEF5"/>
+          </w:tcPr>
+          <w:p>
+            <w:pPr>
+              <w:spacing w:after="0" w:before="0" w:line="240" w:lineRule="auto"/>
+            </w:pPr>
+            <w:r>
+              <w:rPr>
+                <w:rFonts w:ascii="微软雅黑" w:hAnsi="微软雅黑" w:eastAsia="微软雅黑"/>
+                <w:b/>
+                <w:sz w:val="18"/>
+              </w:rPr>
+            </w:r>
+            <w:r>
+              <w:rPr>
+                <w:rFonts w:ascii="微软雅黑" w:hAnsi="微软雅黑" w:eastAsia="微软雅黑"/>
+                <w:b/>
+                <w:sz w:val="18"/>
+              </w:rPr>
+              <w:t>使用说明</w:t>
+            </w:r>
+          </w:p>
+        </w:tc>
+      </w:tr>
+      <w:tr>
+        <w:tc>
+          <w:tcPr>
+            <w:tcW w:type="dxa" w:w="2304"/>
+            <w:vAlign w:val="center"/>
+          </w:tcPr>
+          <w:p>
+            <w:pPr>
+              <w:spacing w:after="0" w:before="0" w:line="240" w:lineRule="auto"/>
+            </w:pPr>
+            <w:r>
+              <w:rPr>
+                <w:rFonts w:ascii="微软雅黑" w:hAnsi="微软雅黑" w:eastAsia="微软雅黑"/>
+                <w:sz w:val="18"/>
+              </w:rPr>
+            </w:r>
+            <w:r>
+              <w:rPr>
+                <w:rFonts w:ascii="微软雅黑" w:hAnsi="微软雅黑" w:eastAsia="微软雅黑"/>
+                <w:b w:val="0"/>
+                <w:sz w:val="18"/>
+              </w:rPr>
+              <w:t>选择规则</w:t>
+            </w:r>
+          </w:p>
+        </w:tc>
+        <w:tc>
+          <w:tcPr>
+            <w:tcW w:type="dxa" w:w="1440"/>
+            <w:vAlign w:val="center"/>
+          </w:tcPr>
+          <w:p>
+            <w:pPr>
+              <w:spacing w:after="0" w:before="0" w:line="240" w:lineRule="auto"/>
+            </w:pPr>
+            <w:r>
+              <w:rPr>
+                <w:rFonts w:ascii="微软雅黑" w:hAnsi="微软雅黑" w:eastAsia="微软雅黑"/>
+                <w:sz w:val="18"/>
+              </w:rPr>
+            </w:r>
+            <w:r>
+              <w:rPr>
+                <w:rFonts w:ascii="微软雅黑" w:hAnsi="微软雅黑" w:eastAsia="微软雅黑"/>
+                <w:b w:val="0"/>
+                <w:sz w:val="18"/>
+              </w:rPr>
+              <w:t>下拉框</w:t>
+            </w:r>
+          </w:p>
+        </w:tc>
+        <w:tc>
+          <w:tcPr>
+            <w:tcW w:type="dxa" w:w="5760"/>
+            <w:vAlign w:val="center"/>
+          </w:tcPr>
+          <w:p>
+            <w:pPr>
+              <w:spacing w:after="0" w:before="0" w:line="240" w:lineRule="auto"/>
+            </w:pPr>
+            <w:r>
+              <w:rPr>
+                <w:rFonts w:ascii="微软雅黑" w:hAnsi="微软雅黑" w:eastAsia="微软雅黑"/>
+                <w:sz w:val="18"/>
+              </w:rPr>
+            </w:r>
+            <w:r>
+              <w:rPr>
+                <w:rFonts w:ascii="微软雅黑" w:hAnsi="微软雅黑" w:eastAsia="微软雅黑"/>
+                <w:b w:val="0"/>
+                <w:sz w:val="18"/>
+              </w:rPr>
+              <w:t>选择要维护的折弯角度区间：90°、0～90°、90～180°或180～360°。</w:t>
+            </w:r>
+          </w:p>
+        </w:tc>
+      </w:tr>
+      <w:tr>
+        <w:tc>
+          <w:tcPr>
+            <w:tcW w:type="dxa" w:w="2304"/>
+            <w:vAlign w:val="center"/>
+          </w:tcPr>
+          <w:p>
+            <w:pPr>
+              <w:spacing w:after="0" w:before="0" w:line="240" w:lineRule="auto"/>
+            </w:pPr>
+            <w:r>
+              <w:rPr>
+                <w:rFonts w:ascii="微软雅黑" w:hAnsi="微软雅黑" w:eastAsia="微软雅黑"/>
+                <w:sz w:val="18"/>
+              </w:rPr>
+            </w:r>
+            <w:r>
+              <w:rPr>
+                <w:rFonts w:ascii="微软雅黑" w:hAnsi="微软雅黑" w:eastAsia="微软雅黑"/>
+                <w:b w:val="0"/>
+                <w:sz w:val="18"/>
+              </w:rPr>
+              <w:t>普通折弯</w:t>
+            </w:r>
+          </w:p>
+        </w:tc>
+        <w:tc>
+          <w:tcPr>
+            <w:tcW w:type="dxa" w:w="1440"/>
+            <w:vAlign w:val="center"/>
+          </w:tcPr>
+          <w:p>
+            <w:pPr>
+              <w:spacing w:after="0" w:before="0" w:line="240" w:lineRule="auto"/>
+            </w:pPr>
+            <w:r>
+              <w:rPr>
+                <w:rFonts w:ascii="微软雅黑" w:hAnsi="微软雅黑" w:eastAsia="微软雅黑"/>
+                <w:sz w:val="18"/>
+              </w:rPr>
+            </w:r>
+            <w:r>
+              <w:rPr>
+                <w:rFonts w:ascii="微软雅黑" w:hAnsi="微软雅黑" w:eastAsia="微软雅黑"/>
+                <w:b w:val="0"/>
+                <w:sz w:val="18"/>
+              </w:rPr>
+              <w:t>下拉框</w:t>
+            </w:r>
+          </w:p>
+        </w:tc>
+        <w:tc>
+          <w:tcPr>
+            <w:tcW w:type="dxa" w:w="5760"/>
+            <w:vAlign w:val="center"/>
+          </w:tcPr>
+          <w:p>
+            <w:pPr>
+              <w:spacing w:after="0" w:before="0" w:line="240" w:lineRule="auto"/>
+            </w:pPr>
+            <w:r>
+              <w:rPr>
+                <w:rFonts w:ascii="微软雅黑" w:hAnsi="微软雅黑" w:eastAsia="微软雅黑"/>
+                <w:sz w:val="18"/>
+              </w:rPr>
+            </w:r>
+            <w:r>
+              <w:rPr>
+                <w:rFonts w:ascii="微软雅黑" w:hAnsi="微软雅黑" w:eastAsia="微软雅黑"/>
+                <w:b w:val="0"/>
+                <w:sz w:val="18"/>
+              </w:rPr>
+              <w:t>指定普通折弯读取扣除1～3、K因子1～3或A1～A3中的哪一列。</w:t>
+            </w:r>
+          </w:p>
+        </w:tc>
+      </w:tr>
+      <w:tr>
+        <w:tc>
+          <w:tcPr>
+            <w:tcW w:type="dxa" w:w="2304"/>
+            <w:vAlign w:val="center"/>
+          </w:tcPr>
+          <w:p>
+            <w:pPr>
+              <w:spacing w:after="0" w:before="0" w:line="240" w:lineRule="auto"/>
+            </w:pPr>
+            <w:r>
+              <w:rPr>
+                <w:rFonts w:ascii="微软雅黑" w:hAnsi="微软雅黑" w:eastAsia="微软雅黑"/>
+                <w:sz w:val="18"/>
+              </w:rPr>
+            </w:r>
+            <w:r>
+              <w:rPr>
+                <w:rFonts w:ascii="微软雅黑" w:hAnsi="微软雅黑" w:eastAsia="微软雅黑"/>
+                <w:b w:val="0"/>
+                <w:sz w:val="18"/>
+              </w:rPr>
+              <w:t>多刀折圆</w:t>
+            </w:r>
+          </w:p>
+        </w:tc>
+        <w:tc>
+          <w:tcPr>
+            <w:tcW w:type="dxa" w:w="1440"/>
+            <w:vAlign w:val="center"/>
+          </w:tcPr>
+          <w:p>
+            <w:pPr>
+              <w:spacing w:after="0" w:before="0" w:line="240" w:lineRule="auto"/>
+            </w:pPr>
+            <w:r>
+              <w:rPr>
+                <w:rFonts w:ascii="微软雅黑" w:hAnsi="微软雅黑" w:eastAsia="微软雅黑"/>
+                <w:sz w:val="18"/>
+              </w:rPr>
+            </w:r>
+            <w:r>
+              <w:rPr>
+                <w:rFonts w:ascii="微软雅黑" w:hAnsi="微软雅黑" w:eastAsia="微软雅黑"/>
+                <w:b w:val="0"/>
+                <w:sz w:val="18"/>
+              </w:rPr>
+              <w:t>下拉框</w:t>
+            </w:r>
+          </w:p>
+        </w:tc>
+        <w:tc>
+          <w:tcPr>
+            <w:tcW w:type="dxa" w:w="5760"/>
+            <w:vAlign w:val="center"/>
+          </w:tcPr>
+          <w:p>
+            <w:pPr>
+              <w:spacing w:after="0" w:before="0" w:line="240" w:lineRule="auto"/>
+            </w:pPr>
+            <w:r>
+              <w:rPr>
+                <w:rFonts w:ascii="微软雅黑" w:hAnsi="微软雅黑" w:eastAsia="微软雅黑"/>
+                <w:sz w:val="18"/>
+              </w:rPr>
+            </w:r>
+            <w:r>
+              <w:rPr>
+                <w:rFonts w:ascii="微软雅黑" w:hAnsi="微软雅黑" w:eastAsia="微软雅黑"/>
+                <w:b w:val="0"/>
+                <w:sz w:val="18"/>
+              </w:rPr>
+              <w:t>指定多刀折圆读取的系数列。截图中选择的是“K因子3”。</w:t>
+            </w:r>
+          </w:p>
+        </w:tc>
+      </w:tr>
+      <w:tr>
+        <w:tc>
+          <w:tcPr>
+            <w:tcW w:type="dxa" w:w="2304"/>
+            <w:vAlign w:val="center"/>
+          </w:tcPr>
+          <w:p>
+            <w:pPr>
+              <w:spacing w:after="0" w:before="0" w:line="240" w:lineRule="auto"/>
+            </w:pPr>
+            <w:r>
+              <w:rPr>
+                <w:rFonts w:ascii="微软雅黑" w:hAnsi="微软雅黑" w:eastAsia="微软雅黑"/>
+                <w:sz w:val="18"/>
+              </w:rPr>
+            </w:r>
+            <w:r>
+              <w:rPr>
+                <w:rFonts w:ascii="微软雅黑" w:hAnsi="微软雅黑" w:eastAsia="微软雅黑"/>
+                <w:b w:val="0"/>
+                <w:sz w:val="18"/>
+              </w:rPr>
+              <w:t>多刀折圆最小半径</w:t>
+            </w:r>
+          </w:p>
+        </w:tc>
+        <w:tc>
+          <w:tcPr>
+            <w:tcW w:type="dxa" w:w="1440"/>
+            <w:vAlign w:val="center"/>
+          </w:tcPr>
+          <w:p>
+            <w:pPr>
+              <w:spacing w:after="0" w:before="0" w:line="240" w:lineRule="auto"/>
+            </w:pPr>
+            <w:r>
+              <w:rPr>
+                <w:rFonts w:ascii="微软雅黑" w:hAnsi="微软雅黑" w:eastAsia="微软雅黑"/>
+                <w:sz w:val="18"/>
+              </w:rPr>
+            </w:r>
+            <w:r>
+              <w:rPr>
+                <w:rFonts w:ascii="微软雅黑" w:hAnsi="微软雅黑" w:eastAsia="微软雅黑"/>
+                <w:b w:val="0"/>
+                <w:sz w:val="18"/>
+              </w:rPr>
+              <w:t>数字输入框</w:t>
+            </w:r>
+          </w:p>
+        </w:tc>
+        <w:tc>
+          <w:tcPr>
+            <w:tcW w:type="dxa" w:w="5760"/>
+            <w:vAlign w:val="center"/>
+          </w:tcPr>
+          <w:p>
+            <w:pPr>
+              <w:spacing w:after="0" w:before="0" w:line="240" w:lineRule="auto"/>
+            </w:pPr>
+            <w:r>
+              <w:rPr>
+                <w:rFonts w:ascii="微软雅黑" w:hAnsi="微软雅黑" w:eastAsia="微软雅黑"/>
+                <w:sz w:val="18"/>
+              </w:rPr>
+            </w:r>
+            <w:r>
+              <w:rPr>
+                <w:rFonts w:ascii="微软雅黑" w:hAnsi="微软雅黑" w:eastAsia="微软雅黑"/>
+                <w:b w:val="0"/>
+                <w:sz w:val="18"/>
+              </w:rPr>
+              <w:t>大于0时启用；达到该半径门槛的圆弧折弯按多刀折圆规则取值。单位跟随零件单位。</w:t>
+            </w:r>
+          </w:p>
+        </w:tc>
+      </w:tr>
+      <w:tr>
+        <w:tc>
+          <w:tcPr>
+            <w:tcW w:type="dxa" w:w="2304"/>
+            <w:vAlign w:val="center"/>
+          </w:tcPr>
+          <w:p>
+            <w:pPr>
+              <w:spacing w:after="0" w:before="0" w:line="240" w:lineRule="auto"/>
+            </w:pPr>
+            <w:r>
+              <w:rPr>
+                <w:rFonts w:ascii="微软雅黑" w:hAnsi="微软雅黑" w:eastAsia="微软雅黑"/>
+                <w:sz w:val="18"/>
+              </w:rPr>
+            </w:r>
+            <w:r>
+              <w:rPr>
+                <w:rFonts w:ascii="微软雅黑" w:hAnsi="微软雅黑" w:eastAsia="微软雅黑"/>
+                <w:b w:val="0"/>
+                <w:sz w:val="18"/>
+              </w:rPr>
+              <w:t>材料分页</w:t>
+            </w:r>
+          </w:p>
+        </w:tc>
+        <w:tc>
+          <w:tcPr>
+            <w:tcW w:type="dxa" w:w="1440"/>
+            <w:vAlign w:val="center"/>
+          </w:tcPr>
+          <w:p>
+            <w:pPr>
+              <w:spacing w:after="0" w:before="0" w:line="240" w:lineRule="auto"/>
+            </w:pPr>
+            <w:r>
+              <w:rPr>
+                <w:rFonts w:ascii="微软雅黑" w:hAnsi="微软雅黑" w:eastAsia="微软雅黑"/>
+                <w:sz w:val="18"/>
+              </w:rPr>
+            </w:r>
+            <w:r>
+              <w:rPr>
+                <w:rFonts w:ascii="微软雅黑" w:hAnsi="微软雅黑" w:eastAsia="微软雅黑"/>
+                <w:b w:val="0"/>
+                <w:sz w:val="18"/>
+              </w:rPr>
+              <w:t>下拉框</w:t>
+            </w:r>
+          </w:p>
+        </w:tc>
+        <w:tc>
+          <w:tcPr>
+            <w:tcW w:type="dxa" w:w="5760"/>
+            <w:vAlign w:val="center"/>
+          </w:tcPr>
+          <w:p>
+            <w:pPr>
+              <w:spacing w:after="0" w:before="0" w:line="240" w:lineRule="auto"/>
+            </w:pPr>
+            <w:r>
+              <w:rPr>
+                <w:rFonts w:ascii="微软雅黑" w:hAnsi="微软雅黑" w:eastAsia="微软雅黑"/>
+                <w:sz w:val="18"/>
+              </w:rPr>
+            </w:r>
+            <w:r>
+              <w:rPr>
+                <w:rFonts w:ascii="微软雅黑" w:hAnsi="微软雅黑" w:eastAsia="微软雅黑"/>
+                <w:b w:val="0"/>
+                <w:sz w:val="18"/>
+              </w:rPr>
+              <w:t>选择“全部”或单一材料，控制下方表格显示范围。</w:t>
+            </w:r>
+          </w:p>
+        </w:tc>
+      </w:tr>
+      <w:tr>
+        <w:tc>
+          <w:tcPr>
+            <w:tcW w:type="dxa" w:w="2304"/>
+            <w:vAlign w:val="center"/>
+          </w:tcPr>
+          <w:p>
+            <w:pPr>
+              <w:spacing w:after="0" w:before="0" w:line="240" w:lineRule="auto"/>
+            </w:pPr>
+            <w:r>
+              <w:rPr>
+                <w:rFonts w:ascii="微软雅黑" w:hAnsi="微软雅黑" w:eastAsia="微软雅黑"/>
+                <w:sz w:val="18"/>
+              </w:rPr>
+            </w:r>
+            <w:r>
+              <w:rPr>
+                <w:rFonts w:ascii="微软雅黑" w:hAnsi="微软雅黑" w:eastAsia="微软雅黑"/>
+                <w:b w:val="0"/>
+                <w:sz w:val="18"/>
+              </w:rPr>
+              <w:t>新增厚度</w:t>
+            </w:r>
+          </w:p>
+        </w:tc>
+        <w:tc>
+          <w:tcPr>
+            <w:tcW w:type="dxa" w:w="1440"/>
+            <w:vAlign w:val="center"/>
+          </w:tcPr>
+          <w:p>
+            <w:pPr>
+              <w:spacing w:after="0" w:before="0" w:line="240" w:lineRule="auto"/>
+            </w:pPr>
+            <w:r>
+              <w:rPr>
+                <w:rFonts w:ascii="微软雅黑" w:hAnsi="微软雅黑" w:eastAsia="微软雅黑"/>
+                <w:sz w:val="18"/>
+              </w:rPr>
+            </w:r>
+            <w:r>
+              <w:rPr>
+                <w:rFonts w:ascii="微软雅黑" w:hAnsi="微软雅黑" w:eastAsia="微软雅黑"/>
+                <w:b w:val="0"/>
+                <w:sz w:val="18"/>
+              </w:rPr>
+              <w:t>按钮</w:t>
+            </w:r>
+          </w:p>
+        </w:tc>
+        <w:tc>
+          <w:tcPr>
+            <w:tcW w:type="dxa" w:w="5760"/>
+            <w:vAlign w:val="center"/>
+          </w:tcPr>
+          <w:p>
+            <w:pPr>
+              <w:spacing w:after="0" w:before="0" w:line="240" w:lineRule="auto"/>
+            </w:pPr>
+            <w:r>
+              <w:rPr>
+                <w:rFonts w:ascii="微软雅黑" w:hAnsi="微软雅黑" w:eastAsia="微软雅黑"/>
+                <w:sz w:val="18"/>
+              </w:rPr>
+            </w:r>
+            <w:r>
+              <w:rPr>
+                <w:rFonts w:ascii="微软雅黑" w:hAnsi="微软雅黑" w:eastAsia="微软雅黑"/>
+                <w:b w:val="0"/>
+                <w:sz w:val="18"/>
+              </w:rPr>
+              <w:t>为材料新增一个厚度规格，再编辑厚度和各系数列。</w:t>
+            </w:r>
+          </w:p>
+        </w:tc>
+      </w:tr>
+      <w:tr>
+        <w:tc>
+          <w:tcPr>
+            <w:tcW w:type="dxa" w:w="2304"/>
+            <w:vAlign w:val="center"/>
+          </w:tcPr>
+          <w:p>
+            <w:pPr>
+              <w:spacing w:after="0" w:before="0" w:line="240" w:lineRule="auto"/>
+            </w:pPr>
+            <w:r>
+              <w:rPr>
+                <w:rFonts w:ascii="微软雅黑" w:hAnsi="微软雅黑" w:eastAsia="微软雅黑"/>
+                <w:sz w:val="18"/>
+              </w:rPr>
+            </w:r>
+            <w:r>
+              <w:rPr>
+                <w:rFonts w:ascii="微软雅黑" w:hAnsi="微软雅黑" w:eastAsia="微软雅黑"/>
+                <w:b w:val="0"/>
+                <w:sz w:val="18"/>
+              </w:rPr>
+              <w:t>系数表格</w:t>
+            </w:r>
+          </w:p>
+        </w:tc>
+        <w:tc>
+          <w:tcPr>
+            <w:tcW w:type="dxa" w:w="1440"/>
+            <w:vAlign w:val="center"/>
+          </w:tcPr>
+          <w:p>
+            <w:pPr>
+              <w:spacing w:after="0" w:before="0" w:line="240" w:lineRule="auto"/>
+            </w:pPr>
+            <w:r>
+              <w:rPr>
+                <w:rFonts w:ascii="微软雅黑" w:hAnsi="微软雅黑" w:eastAsia="微软雅黑"/>
+                <w:sz w:val="18"/>
+              </w:rPr>
+            </w:r>
+            <w:r>
+              <w:rPr>
+                <w:rFonts w:ascii="微软雅黑" w:hAnsi="微软雅黑" w:eastAsia="微软雅黑"/>
+                <w:b w:val="0"/>
+                <w:sz w:val="18"/>
+              </w:rPr>
+              <w:t>可编辑表格</w:t>
+            </w:r>
+          </w:p>
+        </w:tc>
+        <w:tc>
+          <w:tcPr>
+            <w:tcW w:type="dxa" w:w="5760"/>
+            <w:vAlign w:val="center"/>
+          </w:tcPr>
+          <w:p>
+            <w:pPr>
+              <w:spacing w:after="0" w:before="0" w:line="240" w:lineRule="auto"/>
+            </w:pPr>
+            <w:r>
+              <w:rPr>
+                <w:rFonts w:ascii="微软雅黑" w:hAnsi="微软雅黑" w:eastAsia="微软雅黑"/>
+                <w:sz w:val="18"/>
+              </w:rPr>
+            </w:r>
+            <w:r>
+              <w:rPr>
+                <w:rFonts w:ascii="微软雅黑" w:hAnsi="微软雅黑" w:eastAsia="微软雅黑"/>
+                <w:b w:val="0"/>
+                <w:sz w:val="18"/>
+              </w:rPr>
+              <w:t>双击单元格维护材料、厚度、扣除值、K因子和A1～A3。只有上方选中的列参与对应计算。</w:t>
+            </w:r>
+          </w:p>
+        </w:tc>
+      </w:tr>
+      <w:tr>
+        <w:tc>
+          <w:tcPr>
+            <w:tcW w:type="dxa" w:w="2304"/>
+            <w:vAlign w:val="center"/>
+          </w:tcPr>
+          <w:p>
+            <w:pPr>
+              <w:spacing w:after="0" w:before="0" w:line="240" w:lineRule="auto"/>
+            </w:pPr>
+            <w:r>
+              <w:rPr>
+                <w:rFonts w:ascii="微软雅黑" w:hAnsi="微软雅黑" w:eastAsia="微软雅黑"/>
+                <w:sz w:val="18"/>
+              </w:rPr>
+            </w:r>
+            <w:r>
+              <w:rPr>
+                <w:rFonts w:ascii="微软雅黑" w:hAnsi="微软雅黑" w:eastAsia="微软雅黑"/>
+                <w:b w:val="0"/>
+                <w:sz w:val="18"/>
+              </w:rPr>
+              <w:t>保存</w:t>
+            </w:r>
+          </w:p>
+        </w:tc>
+        <w:tc>
+          <w:tcPr>
+            <w:tcW w:type="dxa" w:w="1440"/>
+            <w:vAlign w:val="center"/>
+          </w:tcPr>
+          <w:p>
+            <w:pPr>
+              <w:spacing w:after="0" w:before="0" w:line="240" w:lineRule="auto"/>
+            </w:pPr>
+            <w:r>
+              <w:rPr>
+                <w:rFonts w:ascii="微软雅黑" w:hAnsi="微软雅黑" w:eastAsia="微软雅黑"/>
+                <w:sz w:val="18"/>
+              </w:rPr>
+            </w:r>
+            <w:r>
+              <w:rPr>
+                <w:rFonts w:ascii="微软雅黑" w:hAnsi="微软雅黑" w:eastAsia="微软雅黑"/>
+                <w:b w:val="0"/>
+                <w:sz w:val="18"/>
+              </w:rPr>
+              <w:t>按钮</w:t>
+            </w:r>
+          </w:p>
+        </w:tc>
+        <w:tc>
+          <w:tcPr>
+            <w:tcW w:type="dxa" w:w="5760"/>
+            <w:vAlign w:val="center"/>
+          </w:tcPr>
+          <w:p>
+            <w:pPr>
+              <w:spacing w:after="0" w:before="0" w:line="240" w:lineRule="auto"/>
+            </w:pPr>
+            <w:r>
+              <w:rPr>
+                <w:rFonts w:ascii="微软雅黑" w:hAnsi="微软雅黑" w:eastAsia="微软雅黑"/>
+                <w:sz w:val="18"/>
+              </w:rPr>
+            </w:r>
+            <w:r>
+              <w:rPr>
+                <w:rFonts w:ascii="微软雅黑" w:hAnsi="微软雅黑" w:eastAsia="微软雅黑"/>
+                <w:b w:val="0"/>
+                <w:sz w:val="18"/>
+              </w:rPr>
+              <w:t>将当前规则写入配置文件；每次修改后建议立即保存。</w:t>
+            </w:r>
+          </w:p>
+        </w:tc>
+      </w:tr>
+      <w:tr>
+        <w:tc>
+          <w:tcPr>
+            <w:tcW w:type="dxa" w:w="2304"/>
+            <w:vAlign w:val="center"/>
+          </w:tcPr>
+          <w:p>
+            <w:pPr>
+              <w:spacing w:after="0" w:before="0" w:line="240" w:lineRule="auto"/>
+            </w:pPr>
+            <w:r>
+              <w:rPr>
+                <w:rFonts w:ascii="微软雅黑" w:hAnsi="微软雅黑" w:eastAsia="微软雅黑"/>
+                <w:sz w:val="18"/>
+              </w:rPr>
+            </w:r>
+            <w:r>
+              <w:rPr>
+                <w:rFonts w:ascii="微软雅黑" w:hAnsi="微软雅黑" w:eastAsia="微软雅黑"/>
+                <w:b w:val="0"/>
+                <w:sz w:val="18"/>
+              </w:rPr>
+              <w:t>导入/导出EXCEL数据</w:t>
+            </w:r>
+          </w:p>
+        </w:tc>
+        <w:tc>
+          <w:tcPr>
+            <w:tcW w:type="dxa" w:w="1440"/>
+            <w:vAlign w:val="center"/>
+          </w:tcPr>
+          <w:p>
+            <w:pPr>
+              <w:spacing w:after="0" w:before="0" w:line="240" w:lineRule="auto"/>
+            </w:pPr>
+            <w:r>
+              <w:rPr>
+                <w:rFonts w:ascii="微软雅黑" w:hAnsi="微软雅黑" w:eastAsia="微软雅黑"/>
+                <w:sz w:val="18"/>
+              </w:rPr>
+            </w:r>
+            <w:r>
+              <w:rPr>
+                <w:rFonts w:ascii="微软雅黑" w:hAnsi="微软雅黑" w:eastAsia="微软雅黑"/>
+                <w:b w:val="0"/>
+                <w:sz w:val="18"/>
+              </w:rPr>
+              <w:t>按钮</w:t>
+            </w:r>
+          </w:p>
+        </w:tc>
+        <w:tc>
+          <w:tcPr>
+            <w:tcW w:type="dxa" w:w="5760"/>
+            <w:vAlign w:val="center"/>
+          </w:tcPr>
+          <w:p>
+            <w:pPr>
+              <w:spacing w:after="0" w:before="0" w:line="240" w:lineRule="auto"/>
+            </w:pPr>
+            <w:r>
+              <w:rPr>
+                <w:rFonts w:ascii="微软雅黑" w:hAnsi="微软雅黑" w:eastAsia="微软雅黑"/>
+                <w:sz w:val="18"/>
+              </w:rPr>
+            </w:r>
+            <w:r>
+              <w:rPr>
+                <w:rFonts w:ascii="微软雅黑" w:hAnsi="微软雅黑" w:eastAsia="微软雅黑"/>
+                <w:b w:val="0"/>
+                <w:sz w:val="18"/>
+              </w:rPr>
+              <w:t>批量交换CSV格式的表格数据。导入后先核对内容，再点击保存。</w:t>
+            </w:r>
+          </w:p>
+        </w:tc>
+      </w:tr>
+      <w:tr>
+        <w:tc>
+          <w:tcPr>
+            <w:tcW w:type="dxa" w:w="2304"/>
+            <w:vAlign w:val="center"/>
+          </w:tcPr>
+          <w:p>
+            <w:pPr>
+              <w:spacing w:after="0" w:before="0" w:line="240" w:lineRule="auto"/>
+            </w:pPr>
+            <w:r>
+              <w:rPr>
+                <w:rFonts w:ascii="微软雅黑" w:hAnsi="微软雅黑" w:eastAsia="微软雅黑"/>
+                <w:sz w:val="18"/>
+              </w:rPr>
+            </w:r>
+            <w:r>
+              <w:rPr>
+                <w:rFonts w:ascii="微软雅黑" w:hAnsi="微软雅黑" w:eastAsia="微软雅黑"/>
+                <w:b w:val="0"/>
+                <w:sz w:val="18"/>
+              </w:rPr>
+              <w:t>计算K因子</w:t>
+            </w:r>
+          </w:p>
+        </w:tc>
+        <w:tc>
+          <w:tcPr>
+            <w:tcW w:type="dxa" w:w="1440"/>
+            <w:vAlign w:val="center"/>
+          </w:tcPr>
+          <w:p>
+            <w:pPr>
+              <w:spacing w:after="0" w:before="0" w:line="240" w:lineRule="auto"/>
+            </w:pPr>
+            <w:r>
+              <w:rPr>
+                <w:rFonts w:ascii="微软雅黑" w:hAnsi="微软雅黑" w:eastAsia="微软雅黑"/>
+                <w:sz w:val="18"/>
+              </w:rPr>
+            </w:r>
+            <w:r>
+              <w:rPr>
+                <w:rFonts w:ascii="微软雅黑" w:hAnsi="微软雅黑" w:eastAsia="微软雅黑"/>
+                <w:b w:val="0"/>
+                <w:sz w:val="18"/>
+              </w:rPr>
+              <w:t>按钮</w:t>
+            </w:r>
+          </w:p>
+        </w:tc>
+        <w:tc>
+          <w:tcPr>
+            <w:tcW w:type="dxa" w:w="5760"/>
+            <w:vAlign w:val="center"/>
+          </w:tcPr>
+          <w:p>
+            <w:pPr>
+              <w:spacing w:after="0" w:before="0" w:line="240" w:lineRule="auto"/>
+            </w:pPr>
+            <w:r>
+              <w:rPr>
+                <w:rFonts w:ascii="微软雅黑" w:hAnsi="微软雅黑" w:eastAsia="微软雅黑"/>
+                <w:sz w:val="18"/>
+              </w:rPr>
+            </w:r>
+            <w:r>
+              <w:rPr>
+                <w:rFonts w:ascii="微软雅黑" w:hAnsi="微软雅黑" w:eastAsia="微软雅黑"/>
+                <w:b w:val="0"/>
+                <w:sz w:val="18"/>
+              </w:rPr>
+              <w:t>打开K因子计算工具，用试折或已知展开数据辅助计算。</w:t>
+            </w:r>
+          </w:p>
+        </w:tc>
+      </w:tr>
+      <w:tr>
+        <w:tc>
+          <w:tcPr>
+            <w:tcW w:type="dxa" w:w="2304"/>
+            <w:vAlign w:val="center"/>
+          </w:tcPr>
+          <w:p>
+            <w:pPr>
+              <w:spacing w:after="0" w:before="0" w:line="240" w:lineRule="auto"/>
+            </w:pPr>
+            <w:r>
+              <w:rPr>
+                <w:rFonts w:ascii="微软雅黑" w:hAnsi="微软雅黑" w:eastAsia="微软雅黑"/>
+                <w:sz w:val="18"/>
+              </w:rPr>
+            </w:r>
+            <w:r>
+              <w:rPr>
+                <w:rFonts w:ascii="微软雅黑" w:hAnsi="微软雅黑" w:eastAsia="微软雅黑"/>
+                <w:b w:val="0"/>
+                <w:sz w:val="18"/>
+              </w:rPr>
+              <w:t>确定 / 取消</w:t>
+            </w:r>
+          </w:p>
+        </w:tc>
+        <w:tc>
+          <w:tcPr>
+            <w:tcW w:type="dxa" w:w="1440"/>
+            <w:vAlign w:val="center"/>
+          </w:tcPr>
+          <w:p>
+            <w:pPr>
+              <w:spacing w:after="0" w:before="0" w:line="240" w:lineRule="auto"/>
+            </w:pPr>
+            <w:r>
+              <w:rPr>
+                <w:rFonts w:ascii="微软雅黑" w:hAnsi="微软雅黑" w:eastAsia="微软雅黑"/>
+                <w:sz w:val="18"/>
+              </w:rPr>
+            </w:r>
+            <w:r>
+              <w:rPr>
+                <w:rFonts w:ascii="微软雅黑" w:hAnsi="微软雅黑" w:eastAsia="微软雅黑"/>
+                <w:b w:val="0"/>
+                <w:sz w:val="18"/>
+              </w:rPr>
+              <w:t>按钮</w:t>
+            </w:r>
+          </w:p>
+        </w:tc>
+        <w:tc>
+          <w:tcPr>
+            <w:tcW w:type="dxa" w:w="5760"/>
+            <w:vAlign w:val="center"/>
+          </w:tcPr>
+          <w:p>
+            <w:pPr>
+              <w:spacing w:after="0" w:before="0" w:line="240" w:lineRule="auto"/>
+            </w:pPr>
+            <w:r>
+              <w:rPr>
+                <w:rFonts w:ascii="微软雅黑" w:hAnsi="微软雅黑" w:eastAsia="微软雅黑"/>
+                <w:sz w:val="18"/>
+              </w:rPr>
+            </w:r>
+            <w:r>
+              <w:rPr>
+                <w:rFonts w:ascii="微软雅黑" w:hAnsi="微软雅黑" w:eastAsia="微软雅黑"/>
+                <w:b w:val="0"/>
+                <w:sz w:val="18"/>
+              </w:rPr>
+              <w:t>确定会保存后关闭；取消会放弃尚未保存的修改。</w:t>
+            </w:r>
+          </w:p>
+        </w:tc>
+      </w:tr>
+    </w:tbl>
+    <w:tbl>
+      <w:tblPr>
+        <w:tblW w:type="auto" w:w="0"/>
+        <w:jc w:val="center"/>
+        <w:tblLook w:firstColumn="1" w:firstRow="1" w:lastColumn="0" w:lastRow="0" w:noHBand="0" w:noVBand="1" w:val="04A0"/>
+      </w:tblPr>
+      <w:tblGrid>
+        <w:gridCol w:w="9792"/>
+      </w:tblGrid>
+      <w:tr>
+        <w:tc>
+          <w:tcPr>
+            <w:tcW w:type="dxa" w:w="9792"/>
+            <w:shd w:fill="FFF7E6"/>
+          </w:tcPr>
+          <w:p>
+            <w:pPr>
+              <w:spacing w:after="40"/>
+            </w:pPr>
+            <w:r>
+              <w:rPr>
+                <w:rFonts w:ascii="微软雅黑" w:hAnsi="微软雅黑" w:eastAsia="微软雅黑"/>
+                <w:b/>
+                <w:color w:val="1F4D78"/>
+                <w:sz w:val="21"/>
+              </w:rPr>
+              <w:t>规则列必须对应</w:t>
+            </w:r>
+          </w:p>
+          <w:p>
+            <w:pPr>
+              <w:spacing w:after="0"/>
+            </w:pPr>
+            <w:r>
+              <w:rPr>
+                <w:rFonts w:ascii="微软雅黑" w:hAnsi="微软雅黑" w:eastAsia="微软雅黑"/>
+                <w:sz w:val="20"/>
+              </w:rPr>
+              <w:t>若普通折弯选择“扣除1”，程序读取当前材料和板厚行的“扣除1”；若多刀折圆选择“K因子3”，程序读取“K因子3”。不要只修改某一列，却在上方选择另一列。</w:t>
+            </w:r>
+          </w:p>
+        </w:tc>
+      </w:tr>
+    </w:tbl>
+    <w:p>
+      <w:pPr>
+        <w:pStyle w:val="Heading1"/>
+      </w:pPr>
+      <w:r>
+        <w:t>6. 手动选择基面和 X 向</w:t>
       </w:r>
     </w:p>
     <w:p>
@@ -3884,7 +4922,7 @@
         <w:drawing>
           <wp:inline xmlns:a="http://schemas.openxmlformats.org/drawingml/2006/main" xmlns:pic="http://schemas.openxmlformats.org/drawingml/2006/picture">
             <wp:extent cx="6126480" cy="3150761"/>
-            <wp:docPr id="4" name="Picture 4"/>
+            <wp:docPr id="5" name="Picture 5"/>
             <wp:cNvGraphicFramePr>
               <a:graphicFrameLocks noChangeAspect="1"/>
             </wp:cNvGraphicFramePr>
@@ -3896,7 +4934,7 @@
                     <pic:cNvPicPr/>
                   </pic:nvPicPr>
                   <pic:blipFill>
-                    <a:blip r:embed="rId12"/>
+                    <a:blip r:embed="rId13"/>
                     <a:stretch>
                       <a:fillRect/>
                     </a:stretch>
@@ -4036,7 +5074,7 @@
         <w:pStyle w:val="Heading1"/>
       </w:pPr>
       <w:r>
-        <w:t>6. 结果提示和失败处理</w:t>
+        <w:t>7. 结果提示和失败处理</w:t>
       </w:r>
     </w:p>
     <w:p>
@@ -4044,7 +5082,7 @@
         <w:drawing>
           <wp:inline xmlns:a="http://schemas.openxmlformats.org/drawingml/2006/main" xmlns:pic="http://schemas.openxmlformats.org/drawingml/2006/picture">
             <wp:extent cx="6126480" cy="2275550"/>
-            <wp:docPr id="5" name="Picture 5"/>
+            <wp:docPr id="6" name="Picture 6"/>
             <wp:cNvGraphicFramePr>
               <a:graphicFrameLocks noChangeAspect="1"/>
             </wp:cNvGraphicFramePr>
@@ -4056,7 +5094,7 @@
                     <pic:cNvPicPr/>
                   </pic:nvPicPr>
                   <pic:blipFill>
-                    <a:blip r:embed="rId13"/>
+                    <a:blip r:embed="rId14"/>
                     <a:stretch>
                       <a:fillRect/>
                     </a:stretch>
@@ -4140,7 +5178,7 @@
         <w:pStyle w:val="Heading1"/>
       </w:pPr>
       <w:r>
-        <w:t>7. 常见问题</w:t>
+        <w:t>8. 常见问题</w:t>
       </w:r>
     </w:p>
     <w:tbl>
@@ -4423,7 +5461,7 @@
         <w:pStyle w:val="Heading1"/>
       </w:pPr>
       <w:r>
-        <w:t>8. 建议操作习惯</w:t>
+        <w:t>9. 建议操作习惯</w:t>
       </w:r>
     </w:p>
     <w:p>
@@ -4487,7 +5525,7 @@
       </w:r>
     </w:p>
     <w:sectPr>
-      <w:footerReference w:type="default" r:id="rId14"/>
+      <w:footerReference w:type="default" r:id="rId15"/>
       <w:pgSz w:w="12240" w:h="15840"/>
       <w:pgMar w:top="1152" w:right="1224" w:bottom="1080" w:left="1224" w:header="720" w:footer="720" w:gutter="0"/>
       <w:cols w:space="720"/>

</xml_diff>